<commit_message>
T27: Figma screen designs, design review and document updates
- docs/design: 10 Figma frames as SVG and 2x PNG, with a design review (11 findings and decisions)
- Portfolio: screens table and screen flow updated (bottom navigation, "wrong location?" button), Figma designs in appendix A
- SRS, SDD, PM plan and design guide updated; new task T30 (XML layouts from the designs)
- Wiki pages and Word exports regenerated

Co-Authored-By: Claude Opus 5.5 <noreply@anthropic.com>
Claude-Session: https://claude.ai/code/session_01MBM7aVNNdwe7Kpo155KGSJ
</commit_message>
<xml_diff>
--- a/docs/word/מדריך עיצוב מסכים - ניווט אלוני יצחק.docx
+++ b/docs/word/מדריך עיצוב מסכים - ניווט אלוני יצחק.docx
@@ -2943,6 +2943,2001 @@
       </w:r>
     </w:p>
     <w:bookmarkEnd w:id="42"/>
+    <w:bookmarkStart w:id="50" w:name="העיצובים-שהתקבלו"/>
+    <w:p>
+      <w:pPr>
+        <w:bidi/>
+        <w:pStyle w:val="Heading2"/>
+      </w:pPr>
+      <w:r>
+        <w:rPr>
+          <w:rFonts w:ascii="Arial" w:hAnsi="Arial" w:cs="David"/>
+          <w:rtl/>
+        </w:rPr>
+        <w:t xml:space="preserve">7. העיצובים שהתקבלו</w:t>
+      </w:r>
+    </w:p>
+    <w:p>
+      <w:pPr>
+        <w:bidi/>
+      </w:pPr>
+      <w:r>
+        <w:rPr>
+          <w:rFonts w:ascii="Arial" w:hAnsi="Arial" w:cs="David"/>
+          <w:rtl/>
+        </w:rPr>
+        <w:t xml:space="preserve">עשרה Frames ב-Figma: תשעת המסכים, ומסך הצוות בשני מצבים (כניסה ועריכה). הקבצים נמצאים במאגר: PNG בקנה מידה 2x בתיקייה</w:t>
+      </w:r>
+      <w:r>
+        <w:rPr>
+          <w:rFonts w:ascii="Arial" w:hAnsi="Arial" w:cs="David"/>
+          <w:rtl/>
+        </w:rPr>
+        <w:t xml:space="preserve"> </w:t>
+      </w:r>
+      <w:r>
+        <w:rPr>
+          <w:rFonts w:ascii="Arial" w:hAnsi="Arial" w:cs="David"/>
+          <w:rStyle w:val="VerbatimChar"/>
+        </w:rPr>
+        <w:t xml:space="preserve">docs/design/</w:t>
+      </w:r>
+      <w:r>
+        <w:rPr>
+          <w:rFonts w:ascii="Arial" w:hAnsi="Arial" w:cs="David"/>
+          <w:rtl/>
+        </w:rPr>
+        <w:t xml:space="preserve">, וקובצי SVG מקוריים ב-</w:t>
+      </w:r>
+      <w:r>
+        <w:rPr>
+          <w:rFonts w:ascii="Arial" w:hAnsi="Arial" w:cs="David"/>
+          <w:rStyle w:val="VerbatimChar"/>
+        </w:rPr>
+        <w:t xml:space="preserve">docs/design/svg/</w:t>
+      </w:r>
+      <w:r>
+        <w:rPr>
+          <w:rFonts w:ascii="Arial" w:hAnsi="Arial" w:cs="David"/>
+          <w:rtl/>
+        </w:rPr>
+        <w:t xml:space="preserve">. מקובצי ה-SVG האלה נבנים קובצי ה-XML במטלה T30.</w:t>
+      </w:r>
+    </w:p>
+    <w:tbl>
+      <w:tblPr>
+        <w:bidiVisual/>
+        <w:tblStyle w:val="Table"/>
+        <w:tblW w:type="pct" w:w="5000"/>
+        <w:tblLook w:firstRow="1" w:lastRow="0" w:firstColumn="0" w:lastColumn="0" w:noHBand="0" w:noVBand="0" w:val="0020"/>
+        <w:jc w:val="start"/>
+        <w:tblBorders>
+          <w:top w:val="single" w:sz="4" w:color="BFBFBF"/>
+          <w:left w:val="single" w:sz="4" w:color="BFBFBF"/>
+          <w:bottom w:val="single" w:sz="4" w:color="BFBFBF"/>
+          <w:right w:val="single" w:sz="4" w:color="BFBFBF"/>
+          <w:insideH w:val="single" w:sz="4" w:color="BFBFBF"/>
+          <w:insideV w:val="single" w:sz="4" w:color="BFBFBF"/>
+        </w:tblBorders>
+      </w:tblPr>
+      <w:tblGrid>
+        <w:gridCol w:w="1980"/>
+        <w:gridCol w:w="1980"/>
+        <w:gridCol w:w="1980"/>
+        <w:gridCol w:w="1980"/>
+      </w:tblGrid>
+      <w:tr>
+        <w:trPr>
+          <w:tblHeader w:val="true"/>
+        </w:trPr>
+        <w:tc>
+          <w:tcPr/>
+          <w:p>
+            <w:pPr>
+              <w:bidi/>
+              <w:pStyle w:val="Compact"/>
+            </w:pPr>
+            <w:r>
+              <w:rPr>
+                <w:rFonts w:ascii="Arial" w:hAnsi="Arial" w:cs="David"/>
+                <w:rtl/>
+              </w:rPr>
+              <w:t xml:space="preserve">מסך</w:t>
+            </w:r>
+          </w:p>
+        </w:tc>
+        <w:tc>
+          <w:tcPr/>
+          <w:p>
+            <w:pPr>
+              <w:bidi/>
+              <w:pStyle w:val="Compact"/>
+            </w:pPr>
+            <w:r>
+              <w:rPr>
+                <w:rFonts w:ascii="Arial" w:hAnsi="Arial" w:cs="David"/>
+                <w:rtl/>
+              </w:rPr>
+              <w:t xml:space="preserve">קובץ</w:t>
+            </w:r>
+          </w:p>
+        </w:tc>
+        <w:tc>
+          <w:tcPr/>
+          <w:p>
+            <w:pPr>
+              <w:bidi/>
+              <w:pStyle w:val="Compact"/>
+            </w:pPr>
+            <w:r>
+              <w:rPr>
+                <w:rFonts w:ascii="Arial" w:hAnsi="Arial" w:cs="David"/>
+                <w:rtl/>
+              </w:rPr>
+              <w:t xml:space="preserve">מחלקה</w:t>
+            </w:r>
+          </w:p>
+        </w:tc>
+        <w:tc>
+          <w:tcPr/>
+          <w:p>
+            <w:pPr>
+              <w:bidi/>
+              <w:pStyle w:val="Compact"/>
+            </w:pPr>
+            <w:r>
+              <w:rPr>
+                <w:rFonts w:ascii="Arial" w:hAnsi="Arial" w:cs="David"/>
+                <w:rtl/>
+              </w:rPr>
+              <w:t xml:space="preserve">קובץ XML במטלה T30</w:t>
+            </w:r>
+          </w:p>
+        </w:tc>
+      </w:tr>
+      <w:tr>
+        <w:tc>
+          <w:tcPr/>
+          <w:p>
+            <w:pPr>
+              <w:bidi/>
+              <w:pStyle w:val="Compact"/>
+            </w:pPr>
+            <w:r>
+              <w:rPr>
+                <w:rFonts w:ascii="Arial" w:hAnsi="Arial" w:cs="David"/>
+                <w:rtl/>
+              </w:rPr>
+              <w:t xml:space="preserve">מסך פתיחה</w:t>
+            </w:r>
+          </w:p>
+        </w:tc>
+        <w:tc>
+          <w:tcPr/>
+          <w:p>
+            <w:pPr>
+              <w:bidi/>
+              <w:pStyle w:val="Compact"/>
+            </w:pPr>
+            <w:r>
+              <w:rPr>
+                <w:rFonts w:ascii="Arial" w:hAnsi="Arial" w:cs="David"/>
+                <w:rStyle w:val="VerbatimChar"/>
+              </w:rPr>
+              <w:t xml:space="preserve">splash.png</w:t>
+            </w:r>
+          </w:p>
+        </w:tc>
+        <w:tc>
+          <w:tcPr/>
+          <w:p>
+            <w:pPr>
+              <w:bidi/>
+              <w:pStyle w:val="Compact"/>
+            </w:pPr>
+            <w:r>
+              <w:rPr>
+                <w:rFonts w:ascii="Arial" w:hAnsi="Arial" w:cs="David"/>
+              </w:rPr>
+              <w:t xml:space="preserve">SplashActivity</w:t>
+            </w:r>
+          </w:p>
+        </w:tc>
+        <w:tc>
+          <w:tcPr/>
+          <w:p>
+            <w:pPr>
+              <w:bidi/>
+              <w:pStyle w:val="Compact"/>
+            </w:pPr>
+            <w:r>
+              <w:rPr>
+                <w:rFonts w:ascii="Arial" w:hAnsi="Arial" w:cs="David"/>
+                <w:rStyle w:val="VerbatimChar"/>
+              </w:rPr>
+              <w:t xml:space="preserve">activity_splash.xml</w:t>
+            </w:r>
+          </w:p>
+        </w:tc>
+      </w:tr>
+      <w:tr>
+        <w:tc>
+          <w:tcPr/>
+          <w:p>
+            <w:pPr>
+              <w:bidi/>
+              <w:pStyle w:val="Compact"/>
+            </w:pPr>
+            <w:r>
+              <w:rPr>
+                <w:rFonts w:ascii="Arial" w:hAnsi="Arial" w:cs="David"/>
+                <w:rtl/>
+              </w:rPr>
+              <w:t xml:space="preserve">בקשת הרשאות</w:t>
+            </w:r>
+          </w:p>
+        </w:tc>
+        <w:tc>
+          <w:tcPr/>
+          <w:p>
+            <w:pPr>
+              <w:bidi/>
+              <w:pStyle w:val="Compact"/>
+            </w:pPr>
+            <w:r>
+              <w:rPr>
+                <w:rFonts w:ascii="Arial" w:hAnsi="Arial" w:cs="David"/>
+                <w:rStyle w:val="VerbatimChar"/>
+              </w:rPr>
+              <w:t xml:space="preserve">permissions.png</w:t>
+            </w:r>
+          </w:p>
+        </w:tc>
+        <w:tc>
+          <w:tcPr/>
+          <w:p>
+            <w:pPr>
+              <w:bidi/>
+              <w:pStyle w:val="Compact"/>
+            </w:pPr>
+            <w:r>
+              <w:rPr>
+                <w:rFonts w:ascii="Arial" w:hAnsi="Arial" w:cs="David"/>
+                <w:rtl/>
+              </w:rPr>
+              <w:t xml:space="preserve">SplashActivity (מצב שני)</w:t>
+            </w:r>
+          </w:p>
+        </w:tc>
+        <w:tc>
+          <w:tcPr/>
+          <w:p>
+            <w:pPr>
+              <w:bidi/>
+              <w:pStyle w:val="Compact"/>
+            </w:pPr>
+            <w:r>
+              <w:rPr>
+                <w:rFonts w:ascii="Arial" w:hAnsi="Arial" w:cs="David"/>
+                <w:rStyle w:val="VerbatimChar"/>
+              </w:rPr>
+              <w:t xml:space="preserve">view_permissions.xml</w:t>
+            </w:r>
+          </w:p>
+        </w:tc>
+      </w:tr>
+      <w:tr>
+        <w:tc>
+          <w:tcPr/>
+          <w:p>
+            <w:pPr>
+              <w:bidi/>
+              <w:pStyle w:val="Compact"/>
+            </w:pPr>
+            <w:r>
+              <w:rPr>
+                <w:rFonts w:ascii="Arial" w:hAnsi="Arial" w:cs="David"/>
+                <w:rtl/>
+              </w:rPr>
+              <w:t xml:space="preserve">חיפוש יעד</w:t>
+            </w:r>
+          </w:p>
+        </w:tc>
+        <w:tc>
+          <w:tcPr/>
+          <w:p>
+            <w:pPr>
+              <w:bidi/>
+              <w:pStyle w:val="Compact"/>
+            </w:pPr>
+            <w:r>
+              <w:rPr>
+                <w:rFonts w:ascii="Arial" w:hAnsi="Arial" w:cs="David"/>
+                <w:rStyle w:val="VerbatimChar"/>
+              </w:rPr>
+              <w:t xml:space="preserve">search.png</w:t>
+            </w:r>
+          </w:p>
+        </w:tc>
+        <w:tc>
+          <w:tcPr/>
+          <w:p>
+            <w:pPr>
+              <w:bidi/>
+              <w:pStyle w:val="Compact"/>
+            </w:pPr>
+            <w:r>
+              <w:rPr>
+                <w:rFonts w:ascii="Arial" w:hAnsi="Arial" w:cs="David"/>
+              </w:rPr>
+              <w:t xml:space="preserve">SearchActivity</w:t>
+            </w:r>
+          </w:p>
+        </w:tc>
+        <w:tc>
+          <w:tcPr/>
+          <w:p>
+            <w:pPr>
+              <w:bidi/>
+              <w:pStyle w:val="Compact"/>
+            </w:pPr>
+            <w:r>
+              <w:rPr>
+                <w:rFonts w:ascii="Arial" w:hAnsi="Arial" w:cs="David"/>
+                <w:rStyle w:val="VerbatimChar"/>
+              </w:rPr>
+              <w:t xml:space="preserve">activity_search.xml</w:t>
+            </w:r>
+            <w:r>
+              <w:rPr>
+                <w:rFonts w:ascii="Arial" w:hAnsi="Arial" w:cs="David"/>
+                <w:rtl/>
+              </w:rPr>
+              <w:t xml:space="preserve">,</w:t>
+            </w:r>
+            <w:r>
+              <w:rPr>
+                <w:rFonts w:ascii="Arial" w:hAnsi="Arial" w:cs="David"/>
+                <w:rtl/>
+              </w:rPr>
+              <w:t xml:space="preserve"> </w:t>
+            </w:r>
+            <w:r>
+              <w:rPr>
+                <w:rFonts w:ascii="Arial" w:hAnsi="Arial" w:cs="David"/>
+                <w:rStyle w:val="VerbatimChar"/>
+              </w:rPr>
+              <w:t xml:space="preserve">item_room.xml</w:t>
+            </w:r>
+          </w:p>
+        </w:tc>
+      </w:tr>
+      <w:tr>
+        <w:tc>
+          <w:tcPr/>
+          <w:p>
+            <w:pPr>
+              <w:bidi/>
+              <w:pStyle w:val="Compact"/>
+            </w:pPr>
+            <w:r>
+              <w:rPr>
+                <w:rFonts w:ascii="Arial" w:hAnsi="Arial" w:cs="David"/>
+                <w:rtl/>
+              </w:rPr>
+              <w:t xml:space="preserve">מפה ומסלול</w:t>
+            </w:r>
+          </w:p>
+        </w:tc>
+        <w:tc>
+          <w:tcPr/>
+          <w:p>
+            <w:pPr>
+              <w:bidi/>
+              <w:pStyle w:val="Compact"/>
+            </w:pPr>
+            <w:r>
+              <w:rPr>
+                <w:rFonts w:ascii="Arial" w:hAnsi="Arial" w:cs="David"/>
+                <w:rStyle w:val="VerbatimChar"/>
+              </w:rPr>
+              <w:t xml:space="preserve">map.png</w:t>
+            </w:r>
+          </w:p>
+        </w:tc>
+        <w:tc>
+          <w:tcPr/>
+          <w:p>
+            <w:pPr>
+              <w:bidi/>
+              <w:pStyle w:val="Compact"/>
+            </w:pPr>
+            <w:r>
+              <w:rPr>
+                <w:rFonts w:ascii="Arial" w:hAnsi="Arial" w:cs="David"/>
+              </w:rPr>
+              <w:t xml:space="preserve">MapActivity</w:t>
+            </w:r>
+          </w:p>
+        </w:tc>
+        <w:tc>
+          <w:tcPr/>
+          <w:p>
+            <w:pPr>
+              <w:bidi/>
+              <w:pStyle w:val="Compact"/>
+            </w:pPr>
+            <w:r>
+              <w:rPr>
+                <w:rFonts w:ascii="Arial" w:hAnsi="Arial" w:cs="David"/>
+                <w:rStyle w:val="VerbatimChar"/>
+              </w:rPr>
+              <w:t xml:space="preserve">activity_map.xml</w:t>
+            </w:r>
+          </w:p>
+        </w:tc>
+      </w:tr>
+      <w:tr>
+        <w:tc>
+          <w:tcPr/>
+          <w:p>
+            <w:pPr>
+              <w:bidi/>
+              <w:pStyle w:val="Compact"/>
+            </w:pPr>
+            <w:r>
+              <w:rPr>
+                <w:rFonts w:ascii="Arial" w:hAnsi="Arial" w:cs="David"/>
+                <w:rtl/>
+              </w:rPr>
+              <w:t xml:space="preserve">מצלמה AR</w:t>
+            </w:r>
+          </w:p>
+        </w:tc>
+        <w:tc>
+          <w:tcPr/>
+          <w:p>
+            <w:pPr>
+              <w:bidi/>
+              <w:pStyle w:val="Compact"/>
+            </w:pPr>
+            <w:r>
+              <w:rPr>
+                <w:rFonts w:ascii="Arial" w:hAnsi="Arial" w:cs="David"/>
+                <w:rStyle w:val="VerbatimChar"/>
+              </w:rPr>
+              <w:t xml:space="preserve">ar-nav.png</w:t>
+            </w:r>
+          </w:p>
+        </w:tc>
+        <w:tc>
+          <w:tcPr/>
+          <w:p>
+            <w:pPr>
+              <w:bidi/>
+              <w:pStyle w:val="Compact"/>
+            </w:pPr>
+            <w:r>
+              <w:rPr>
+                <w:rFonts w:ascii="Arial" w:hAnsi="Arial" w:cs="David"/>
+              </w:rPr>
+              <w:t xml:space="preserve">ArNavActivity</w:t>
+            </w:r>
+          </w:p>
+        </w:tc>
+        <w:tc>
+          <w:tcPr/>
+          <w:p>
+            <w:pPr>
+              <w:bidi/>
+              <w:pStyle w:val="Compact"/>
+            </w:pPr>
+            <w:r>
+              <w:rPr>
+                <w:rFonts w:ascii="Arial" w:hAnsi="Arial" w:cs="David"/>
+                <w:rStyle w:val="VerbatimChar"/>
+              </w:rPr>
+              <w:t xml:space="preserve">activity_ar_nav.xml</w:t>
+            </w:r>
+          </w:p>
+        </w:tc>
+      </w:tr>
+      <w:tr>
+        <w:tc>
+          <w:tcPr/>
+          <w:p>
+            <w:pPr>
+              <w:bidi/>
+              <w:pStyle w:val="Compact"/>
+            </w:pPr>
+            <w:r>
+              <w:rPr>
+                <w:rFonts w:ascii="Arial" w:hAnsi="Arial" w:cs="David"/>
+                <w:rtl/>
+              </w:rPr>
+              <w:t xml:space="preserve">הגעת ליעד</w:t>
+            </w:r>
+          </w:p>
+        </w:tc>
+        <w:tc>
+          <w:tcPr/>
+          <w:p>
+            <w:pPr>
+              <w:bidi/>
+              <w:pStyle w:val="Compact"/>
+            </w:pPr>
+            <w:r>
+              <w:rPr>
+                <w:rFonts w:ascii="Arial" w:hAnsi="Arial" w:cs="David"/>
+                <w:rStyle w:val="VerbatimChar"/>
+              </w:rPr>
+              <w:t xml:space="preserve">arrival-dialog.png</w:t>
+            </w:r>
+          </w:p>
+        </w:tc>
+        <w:tc>
+          <w:tcPr/>
+          <w:p>
+            <w:pPr>
+              <w:bidi/>
+              <w:pStyle w:val="Compact"/>
+            </w:pPr>
+            <w:r>
+              <w:rPr>
+                <w:rFonts w:ascii="Arial" w:hAnsi="Arial" w:cs="David"/>
+              </w:rPr>
+              <w:t xml:space="preserve">ArrivalDialog</w:t>
+            </w:r>
+          </w:p>
+        </w:tc>
+        <w:tc>
+          <w:tcPr/>
+          <w:p>
+            <w:pPr>
+              <w:bidi/>
+              <w:pStyle w:val="Compact"/>
+            </w:pPr>
+            <w:r>
+              <w:rPr>
+                <w:rFonts w:ascii="Arial" w:hAnsi="Arial" w:cs="David"/>
+                <w:rStyle w:val="VerbatimChar"/>
+              </w:rPr>
+              <w:t xml:space="preserve">dialog_arrival.xml</w:t>
+            </w:r>
+          </w:p>
+        </w:tc>
+      </w:tr>
+      <w:tr>
+        <w:tc>
+          <w:tcPr/>
+          <w:p>
+            <w:pPr>
+              <w:bidi/>
+              <w:pStyle w:val="Compact"/>
+            </w:pPr>
+            <w:r>
+              <w:rPr>
+                <w:rFonts w:ascii="Arial" w:hAnsi="Arial" w:cs="David"/>
+                <w:rtl/>
+              </w:rPr>
+              <w:t xml:space="preserve">כיול ידני</w:t>
+            </w:r>
+          </w:p>
+        </w:tc>
+        <w:tc>
+          <w:tcPr/>
+          <w:p>
+            <w:pPr>
+              <w:bidi/>
+              <w:pStyle w:val="Compact"/>
+            </w:pPr>
+            <w:r>
+              <w:rPr>
+                <w:rFonts w:ascii="Arial" w:hAnsi="Arial" w:cs="David"/>
+                <w:rStyle w:val="VerbatimChar"/>
+              </w:rPr>
+              <w:t xml:space="preserve">calibration-dialog.png</w:t>
+            </w:r>
+          </w:p>
+        </w:tc>
+        <w:tc>
+          <w:tcPr/>
+          <w:p>
+            <w:pPr>
+              <w:bidi/>
+              <w:pStyle w:val="Compact"/>
+            </w:pPr>
+            <w:r>
+              <w:rPr>
+                <w:rFonts w:ascii="Arial" w:hAnsi="Arial" w:cs="David"/>
+              </w:rPr>
+              <w:t xml:space="preserve">CalibrationDialog</w:t>
+            </w:r>
+          </w:p>
+        </w:tc>
+        <w:tc>
+          <w:tcPr/>
+          <w:p>
+            <w:pPr>
+              <w:bidi/>
+              <w:pStyle w:val="Compact"/>
+            </w:pPr>
+            <w:r>
+              <w:rPr>
+                <w:rFonts w:ascii="Arial" w:hAnsi="Arial" w:cs="David"/>
+                <w:rStyle w:val="VerbatimChar"/>
+              </w:rPr>
+              <w:t xml:space="preserve">dialog_calibration.xml</w:t>
+            </w:r>
+          </w:p>
+        </w:tc>
+      </w:tr>
+      <w:tr>
+        <w:tc>
+          <w:tcPr/>
+          <w:p>
+            <w:pPr>
+              <w:bidi/>
+              <w:pStyle w:val="Compact"/>
+            </w:pPr>
+            <w:r>
+              <w:rPr>
+                <w:rFonts w:ascii="Arial" w:hAnsi="Arial" w:cs="David"/>
+                <w:rtl/>
+              </w:rPr>
+              <w:t xml:space="preserve">כניסת צוות</w:t>
+            </w:r>
+          </w:p>
+        </w:tc>
+        <w:tc>
+          <w:tcPr/>
+          <w:p>
+            <w:pPr>
+              <w:bidi/>
+              <w:pStyle w:val="Compact"/>
+            </w:pPr>
+            <w:r>
+              <w:rPr>
+                <w:rFonts w:ascii="Arial" w:hAnsi="Arial" w:cs="David"/>
+                <w:rStyle w:val="VerbatimChar"/>
+              </w:rPr>
+              <w:t xml:space="preserve">admin-login.png</w:t>
+            </w:r>
+          </w:p>
+        </w:tc>
+        <w:tc>
+          <w:tcPr/>
+          <w:p>
+            <w:pPr>
+              <w:bidi/>
+              <w:pStyle w:val="Compact"/>
+            </w:pPr>
+            <w:r>
+              <w:rPr>
+                <w:rFonts w:ascii="Arial" w:hAnsi="Arial" w:cs="David"/>
+                <w:rtl/>
+              </w:rPr>
+              <w:t xml:space="preserve">AdminActivity (מצב כניסה)</w:t>
+            </w:r>
+          </w:p>
+        </w:tc>
+        <w:tc>
+          <w:tcPr/>
+          <w:p>
+            <w:pPr>
+              <w:bidi/>
+              <w:pStyle w:val="Compact"/>
+            </w:pPr>
+            <w:r>
+              <w:rPr>
+                <w:rFonts w:ascii="Arial" w:hAnsi="Arial" w:cs="David"/>
+                <w:rStyle w:val="VerbatimChar"/>
+              </w:rPr>
+              <w:t xml:space="preserve">activity_admin.xml</w:t>
+            </w:r>
+          </w:p>
+        </w:tc>
+      </w:tr>
+      <w:tr>
+        <w:tc>
+          <w:tcPr/>
+          <w:p>
+            <w:pPr>
+              <w:bidi/>
+              <w:pStyle w:val="Compact"/>
+            </w:pPr>
+            <w:r>
+              <w:rPr>
+                <w:rFonts w:ascii="Arial" w:hAnsi="Arial" w:cs="David"/>
+                <w:rtl/>
+              </w:rPr>
+              <w:t xml:space="preserve">ניהול חדרים</w:t>
+            </w:r>
+          </w:p>
+        </w:tc>
+        <w:tc>
+          <w:tcPr/>
+          <w:p>
+            <w:pPr>
+              <w:bidi/>
+              <w:pStyle w:val="Compact"/>
+            </w:pPr>
+            <w:r>
+              <w:rPr>
+                <w:rFonts w:ascii="Arial" w:hAnsi="Arial" w:cs="David"/>
+                <w:rStyle w:val="VerbatimChar"/>
+              </w:rPr>
+              <w:t xml:space="preserve">admin.png</w:t>
+            </w:r>
+          </w:p>
+        </w:tc>
+        <w:tc>
+          <w:tcPr/>
+          <w:p>
+            <w:pPr>
+              <w:bidi/>
+              <w:pStyle w:val="Compact"/>
+            </w:pPr>
+            <w:r>
+              <w:rPr>
+                <w:rFonts w:ascii="Arial" w:hAnsi="Arial" w:cs="David"/>
+                <w:rtl/>
+              </w:rPr>
+              <w:t xml:space="preserve">AdminActivity (מצב עריכה)</w:t>
+            </w:r>
+          </w:p>
+        </w:tc>
+        <w:tc>
+          <w:tcPr/>
+          <w:p>
+            <w:pPr>
+              <w:bidi/>
+              <w:pStyle w:val="Compact"/>
+            </w:pPr>
+            <w:r>
+              <w:rPr>
+                <w:rFonts w:ascii="Arial" w:hAnsi="Arial" w:cs="David"/>
+                <w:rStyle w:val="VerbatimChar"/>
+              </w:rPr>
+              <w:t xml:space="preserve">sheet_room_edit.xml</w:t>
+            </w:r>
+          </w:p>
+        </w:tc>
+      </w:tr>
+      <w:tr>
+        <w:tc>
+          <w:tcPr/>
+          <w:p>
+            <w:pPr>
+              <w:bidi/>
+              <w:pStyle w:val="Compact"/>
+            </w:pPr>
+            <w:r>
+              <w:rPr>
+                <w:rFonts w:ascii="Arial" w:hAnsi="Arial" w:cs="David"/>
+                <w:rtl/>
+              </w:rPr>
+              <w:t xml:space="preserve">התאמת מפה שנתית</w:t>
+            </w:r>
+          </w:p>
+        </w:tc>
+        <w:tc>
+          <w:tcPr/>
+          <w:p>
+            <w:pPr>
+              <w:bidi/>
+              <w:pStyle w:val="Compact"/>
+            </w:pPr>
+            <w:r>
+              <w:rPr>
+                <w:rFonts w:ascii="Arial" w:hAnsi="Arial" w:cs="David"/>
+                <w:rStyle w:val="VerbatimChar"/>
+              </w:rPr>
+              <w:t xml:space="preserve">map-alignment.png</w:t>
+            </w:r>
+          </w:p>
+        </w:tc>
+        <w:tc>
+          <w:tcPr/>
+          <w:p>
+            <w:pPr>
+              <w:bidi/>
+              <w:pStyle w:val="Compact"/>
+            </w:pPr>
+            <w:r>
+              <w:rPr>
+                <w:rFonts w:ascii="Arial" w:hAnsi="Arial" w:cs="David"/>
+              </w:rPr>
+              <w:t xml:space="preserve">MapAlignmentActivity</w:t>
+            </w:r>
+          </w:p>
+        </w:tc>
+        <w:tc>
+          <w:tcPr/>
+          <w:p>
+            <w:pPr>
+              <w:bidi/>
+              <w:pStyle w:val="Compact"/>
+            </w:pPr>
+            <w:r>
+              <w:rPr>
+                <w:rFonts w:ascii="Arial" w:hAnsi="Arial" w:cs="David"/>
+                <w:rStyle w:val="VerbatimChar"/>
+              </w:rPr>
+              <w:t xml:space="preserve">activity_map_alignment.xml</w:t>
+            </w:r>
+          </w:p>
+        </w:tc>
+      </w:tr>
+    </w:tbl>
+    <w:p>
+      <w:pPr>
+        <w:bidi/>
+        <w:pStyle w:val="CaptionedFigure"/>
+      </w:pPr>
+      <w:r>
+        <w:rPr>
+          <w:rFonts w:ascii="Arial" w:hAnsi="Arial" w:cs="David"/>
+          <w:rtl/>
+        </w:rPr>
+        <w:drawing>
+          <wp:inline>
+            <wp:extent cx="5334000" cy="2663771"/>
+            <wp:effectExtent b="0" l="0" r="0" t="0"/>
+            <wp:docPr descr="עיצובי המסכים, חלק 1: פתיחה, הרשאות, חיפוש, מפה ומצלמה" title="" id="44" name="Picture"/>
+            <a:graphic>
+              <a:graphicData uri="http://schemas.openxmlformats.org/drawingml/2006/picture">
+                <pic:pic>
+                  <pic:nvPicPr>
+                    <pic:cNvPr descr="/root/.claude/projects/-home-claude/e43bf434-51a5-5c28-828a-12ddd14e064e/tool-results/design-scr-dsgn01.png" id="45" name="Picture"/>
+                    <pic:cNvPicPr>
+                      <a:picLocks noChangeArrowheads="1" noChangeAspect="1"/>
+                    </pic:cNvPicPr>
+                  </pic:nvPicPr>
+                  <pic:blipFill>
+                    <a:blip r:embed="rId43"/>
+                    <a:stretch>
+                      <a:fillRect/>
+                    </a:stretch>
+                  </pic:blipFill>
+                  <pic:spPr bwMode="auto">
+                    <a:xfrm>
+                      <a:off x="0" y="0"/>
+                      <a:ext cx="5334000" cy="2663771"/>
+                    </a:xfrm>
+                    <a:prstGeom prst="rect">
+                      <a:avLst/>
+                    </a:prstGeom>
+                    <a:noFill/>
+                    <a:ln w="9525">
+                      <a:noFill/>
+                      <a:headEnd/>
+                      <a:tailEnd/>
+                    </a:ln>
+                  </pic:spPr>
+                </pic:pic>
+              </a:graphicData>
+            </a:graphic>
+          </wp:inline>
+        </w:drawing>
+      </w:r>
+    </w:p>
+    <w:p>
+      <w:pPr>
+        <w:bidi/>
+        <w:pStyle w:val="ImageCaption"/>
+      </w:pPr>
+      <w:r>
+        <w:rPr>
+          <w:rFonts w:ascii="Arial" w:hAnsi="Arial" w:cs="David"/>
+          <w:rtl/>
+        </w:rPr>
+        <w:t xml:space="preserve">עיצובי המסכים, חלק 1: פתיחה, הרשאות, חיפוש, מפה ומצלמה</w:t>
+      </w:r>
+    </w:p>
+    <w:p>
+      <w:pPr>
+        <w:bidi/>
+        <w:pStyle w:val="CaptionedFigure"/>
+      </w:pPr>
+      <w:r>
+        <w:rPr>
+          <w:rFonts w:ascii="Arial" w:hAnsi="Arial" w:cs="David"/>
+          <w:rtl/>
+        </w:rPr>
+        <w:drawing>
+          <wp:inline>
+            <wp:extent cx="5334000" cy="2583050"/>
+            <wp:effectExtent b="0" l="0" r="0" t="0"/>
+            <wp:docPr descr="עיצובי המסכים, חלק 2: הגעה ליעד, כיול, כניסת צוות, ניהול חדרים והתאמת מפה" title="" id="47" name="Picture"/>
+            <a:graphic>
+              <a:graphicData uri="http://schemas.openxmlformats.org/drawingml/2006/picture">
+                <pic:pic>
+                  <pic:nvPicPr>
+                    <pic:cNvPr descr="/root/.claude/projects/-home-claude/e43bf434-51a5-5c28-828a-12ddd14e064e/tool-results/design-scr-dsgn02.png" id="48" name="Picture"/>
+                    <pic:cNvPicPr>
+                      <a:picLocks noChangeArrowheads="1" noChangeAspect="1"/>
+                    </pic:cNvPicPr>
+                  </pic:nvPicPr>
+                  <pic:blipFill>
+                    <a:blip r:embed="rId46"/>
+                    <a:stretch>
+                      <a:fillRect/>
+                    </a:stretch>
+                  </pic:blipFill>
+                  <pic:spPr bwMode="auto">
+                    <a:xfrm>
+                      <a:off x="0" y="0"/>
+                      <a:ext cx="5334000" cy="2583050"/>
+                    </a:xfrm>
+                    <a:prstGeom prst="rect">
+                      <a:avLst/>
+                    </a:prstGeom>
+                    <a:noFill/>
+                    <a:ln w="9525">
+                      <a:noFill/>
+                      <a:headEnd/>
+                      <a:tailEnd/>
+                    </a:ln>
+                  </pic:spPr>
+                </pic:pic>
+              </a:graphicData>
+            </a:graphic>
+          </wp:inline>
+        </w:drawing>
+      </w:r>
+    </w:p>
+    <w:p>
+      <w:pPr>
+        <w:bidi/>
+        <w:pStyle w:val="ImageCaption"/>
+      </w:pPr>
+      <w:r>
+        <w:rPr>
+          <w:rFonts w:ascii="Arial" w:hAnsi="Arial" w:cs="David"/>
+          <w:rtl/>
+        </w:rPr>
+        <w:t xml:space="preserve">עיצובי המסכים, חלק 2: הגעה ליעד, כיול, כניסת צוות, ניהול חדרים והתאמת מפה</w:t>
+      </w:r>
+    </w:p>
+    <w:bookmarkStart w:id="49" w:name="סקירת-העיצוב"/>
+    <w:p>
+      <w:pPr>
+        <w:bidi/>
+        <w:pStyle w:val="Heading3"/>
+      </w:pPr>
+      <w:r>
+        <w:rPr>
+          <w:rFonts w:ascii="Arial" w:hAnsi="Arial" w:cs="David"/>
+          <w:rtl/>
+        </w:rPr>
+        <w:t xml:space="preserve">7.1 סקירת העיצוב</w:t>
+      </w:r>
+    </w:p>
+    <w:p>
+      <w:pPr>
+        <w:bidi/>
+      </w:pPr>
+      <w:r>
+        <w:rPr>
+          <w:rFonts w:ascii="Arial" w:hAnsi="Arial" w:cs="David"/>
+          <w:rtl/>
+        </w:rPr>
+        <w:t xml:space="preserve">כל מסך נבדק מול רשימת הבדיקה (סעיף 6) ומול מסמך הדרישות. שפת העיצוב נשמרה: ירוק ראשי, כתום למסלול ולחץ, כרטיסים מעוגלים ויישור לימין. אלה הממצאים, ומה הוחלט לגבי כל אחד:</w:t>
+      </w:r>
+    </w:p>
+    <w:tbl>
+      <w:tblPr>
+        <w:bidiVisual/>
+        <w:tblStyle w:val="Table"/>
+        <w:tblW w:type="pct" w:w="5000"/>
+        <w:tblLook w:firstRow="1" w:lastRow="0" w:firstColumn="0" w:lastColumn="0" w:noHBand="0" w:noVBand="0" w:val="0020"/>
+        <w:jc w:val="start"/>
+        <w:tblBorders>
+          <w:top w:val="single" w:sz="4" w:color="BFBFBF"/>
+          <w:left w:val="single" w:sz="4" w:color="BFBFBF"/>
+          <w:bottom w:val="single" w:sz="4" w:color="BFBFBF"/>
+          <w:right w:val="single" w:sz="4" w:color="BFBFBF"/>
+          <w:insideH w:val="single" w:sz="4" w:color="BFBFBF"/>
+          <w:insideV w:val="single" w:sz="4" w:color="BFBFBF"/>
+        </w:tblBorders>
+      </w:tblPr>
+      <w:tblGrid>
+        <w:gridCol w:w="1980"/>
+        <w:gridCol w:w="1980"/>
+        <w:gridCol w:w="1980"/>
+        <w:gridCol w:w="1980"/>
+      </w:tblGrid>
+      <w:tr>
+        <w:trPr>
+          <w:tblHeader w:val="true"/>
+        </w:trPr>
+        <w:tc>
+          <w:tcPr/>
+          <w:p>
+            <w:pPr>
+              <w:bidi/>
+              <w:pStyle w:val="Compact"/>
+            </w:pPr>
+            <w:r>
+              <w:rPr>
+                <w:rFonts w:ascii="Arial" w:hAnsi="Arial" w:cs="David"/>
+                <w:rtl/>
+              </w:rPr>
+              <w:t xml:space="preserve">#</w:t>
+            </w:r>
+          </w:p>
+        </w:tc>
+        <w:tc>
+          <w:tcPr/>
+          <w:p>
+            <w:pPr>
+              <w:bidi/>
+              <w:pStyle w:val="Compact"/>
+            </w:pPr>
+            <w:r>
+              <w:rPr>
+                <w:rFonts w:ascii="Arial" w:hAnsi="Arial" w:cs="David"/>
+                <w:rtl/>
+              </w:rPr>
+              <w:t xml:space="preserve">מסך</w:t>
+            </w:r>
+          </w:p>
+        </w:tc>
+        <w:tc>
+          <w:tcPr/>
+          <w:p>
+            <w:pPr>
+              <w:bidi/>
+              <w:pStyle w:val="Compact"/>
+            </w:pPr>
+            <w:r>
+              <w:rPr>
+                <w:rFonts w:ascii="Arial" w:hAnsi="Arial" w:cs="David"/>
+                <w:rtl/>
+              </w:rPr>
+              <w:t xml:space="preserve">ממצא</w:t>
+            </w:r>
+          </w:p>
+        </w:tc>
+        <w:tc>
+          <w:tcPr/>
+          <w:p>
+            <w:pPr>
+              <w:bidi/>
+              <w:pStyle w:val="Compact"/>
+            </w:pPr>
+            <w:r>
+              <w:rPr>
+                <w:rFonts w:ascii="Arial" w:hAnsi="Arial" w:cs="David"/>
+                <w:rtl/>
+              </w:rPr>
+              <w:t xml:space="preserve">החלטה</w:t>
+            </w:r>
+          </w:p>
+        </w:tc>
+      </w:tr>
+      <w:tr>
+        <w:tc>
+          <w:tcPr/>
+          <w:p>
+            <w:pPr>
+              <w:bidi/>
+              <w:pStyle w:val="Compact"/>
+            </w:pPr>
+            <w:r>
+              <w:rPr>
+                <w:rFonts w:ascii="Arial" w:hAnsi="Arial" w:cs="David"/>
+              </w:rPr>
+              <w:t xml:space="preserve">1</w:t>
+            </w:r>
+          </w:p>
+        </w:tc>
+        <w:tc>
+          <w:tcPr/>
+          <w:p>
+            <w:pPr>
+              <w:bidi/>
+              <w:pStyle w:val="Compact"/>
+            </w:pPr>
+            <w:r>
+              <w:rPr>
+                <w:rFonts w:ascii="Arial" w:hAnsi="Arial" w:cs="David"/>
+                <w:rtl/>
+              </w:rPr>
+              <w:t xml:space="preserve">ארבעת המסכים הראשיים</w:t>
+            </w:r>
+          </w:p>
+        </w:tc>
+        <w:tc>
+          <w:tcPr/>
+          <w:p>
+            <w:pPr>
+              <w:bidi/>
+              <w:pStyle w:val="Compact"/>
+            </w:pPr>
+            <w:r>
+              <w:rPr>
+                <w:rFonts w:ascii="Arial" w:hAnsi="Arial" w:cs="David"/>
+                <w:rtl/>
+              </w:rPr>
+              <w:t xml:space="preserve">נוסף סרגל ניווט תחתון עם ארבע לשוניות: חיפוש יעד, מפה ומסלול, מצלמה AR, ניהול צוות. הוא לא הופיע באפיון</w:t>
+            </w:r>
+          </w:p>
+        </w:tc>
+        <w:tc>
+          <w:tcPr/>
+          <w:p>
+            <w:pPr>
+              <w:bidi/>
+              <w:pStyle w:val="Compact"/>
+            </w:pPr>
+            <w:r>
+              <w:rPr>
+                <w:rFonts w:ascii="Arial" w:hAnsi="Arial" w:cs="David"/>
+                <w:bCs/>
+                <w:b/>
+                <w:rtl/>
+              </w:rPr>
+              <w:t xml:space="preserve">מאמצים.</w:t>
+            </w:r>
+            <w:r>
+              <w:rPr>
+                <w:rFonts w:ascii="Arial" w:hAnsi="Arial" w:cs="David"/>
+                <w:rtl/>
+              </w:rPr>
+              <w:t xml:space="preserve"> </w:t>
+            </w:r>
+            <w:r>
+              <w:rPr>
+                <w:rFonts w:ascii="Arial" w:hAnsi="Arial" w:cs="David"/>
+                <w:rStyle w:val="VerbatimChar"/>
+              </w:rPr>
+              <w:t xml:space="preserve">BottomNavigationView</w:t>
+            </w:r>
+            <w:r>
+              <w:rPr>
+                <w:rFonts w:ascii="Arial" w:hAnsi="Arial" w:cs="David"/>
+                <w:rtl/>
+              </w:rPr>
+              <w:t xml:space="preserve"> </w:t>
+            </w:r>
+            <w:r>
+              <w:rPr>
+                <w:rFonts w:ascii="Arial" w:hAnsi="Arial" w:cs="David"/>
+                <w:rtl/>
+              </w:rPr>
+              <w:t xml:space="preserve">משותף לארבעת המסכים, ותרשים המסכים מתעדכן</w:t>
+            </w:r>
+          </w:p>
+        </w:tc>
+      </w:tr>
+      <w:tr>
+        <w:tc>
+          <w:tcPr/>
+          <w:p>
+            <w:pPr>
+              <w:bidi/>
+              <w:pStyle w:val="Compact"/>
+            </w:pPr>
+            <w:r>
+              <w:rPr>
+                <w:rFonts w:ascii="Arial" w:hAnsi="Arial" w:cs="David"/>
+              </w:rPr>
+              <w:t xml:space="preserve">2</w:t>
+            </w:r>
+          </w:p>
+        </w:tc>
+        <w:tc>
+          <w:tcPr/>
+          <w:p>
+            <w:pPr>
+              <w:bidi/>
+              <w:pStyle w:val="Compact"/>
+            </w:pPr>
+            <w:r>
+              <w:rPr>
+                <w:rFonts w:ascii="Arial" w:hAnsi="Arial" w:cs="David"/>
+                <w:rtl/>
+              </w:rPr>
+              <w:t xml:space="preserve">חיפוש יעד</w:t>
+            </w:r>
+          </w:p>
+        </w:tc>
+        <w:tc>
+          <w:tcPr/>
+          <w:p>
+            <w:pPr>
+              <w:bidi/>
+              <w:pStyle w:val="Compact"/>
+            </w:pPr>
+            <w:r>
+              <w:rPr>
+                <w:rFonts w:ascii="Arial" w:hAnsi="Arial" w:cs="David"/>
+                <w:rtl/>
+              </w:rPr>
+              <w:t xml:space="preserve">הכניסה לצוות היא לשונית גלויה, ולא כפתור נסתר כמו באפיון</w:t>
+            </w:r>
+          </w:p>
+        </w:tc>
+        <w:tc>
+          <w:tcPr/>
+          <w:p>
+            <w:pPr>
+              <w:bidi/>
+              <w:pStyle w:val="Compact"/>
+            </w:pPr>
+            <w:r>
+              <w:rPr>
+                <w:rFonts w:ascii="Arial" w:hAnsi="Arial" w:cs="David"/>
+                <w:bCs/>
+                <w:b/>
+                <w:rtl/>
+              </w:rPr>
+              <w:t xml:space="preserve">מאמצים.</w:t>
+            </w:r>
+            <w:r>
+              <w:rPr>
+                <w:rFonts w:ascii="Arial" w:hAnsi="Arial" w:cs="David"/>
+                <w:rtl/>
+              </w:rPr>
+              <w:t xml:space="preserve"> </w:t>
+            </w:r>
+            <w:r>
+              <w:rPr>
+                <w:rFonts w:ascii="Arial" w:hAnsi="Arial" w:cs="David"/>
+                <w:rtl/>
+              </w:rPr>
+              <w:t xml:space="preserve">מסך הצוות מוגן בהתחברות, ואין סיבה להסתיר אותו</w:t>
+            </w:r>
+          </w:p>
+        </w:tc>
+      </w:tr>
+      <w:tr>
+        <w:tc>
+          <w:tcPr/>
+          <w:p>
+            <w:pPr>
+              <w:bidi/>
+              <w:pStyle w:val="Compact"/>
+            </w:pPr>
+            <w:r>
+              <w:rPr>
+                <w:rFonts w:ascii="Arial" w:hAnsi="Arial" w:cs="David"/>
+              </w:rPr>
+              <w:t xml:space="preserve">3</w:t>
+            </w:r>
+          </w:p>
+        </w:tc>
+        <w:tc>
+          <w:tcPr/>
+          <w:p>
+            <w:pPr>
+              <w:bidi/>
+              <w:pStyle w:val="Compact"/>
+            </w:pPr>
+            <w:r>
+              <w:rPr>
+                <w:rFonts w:ascii="Arial" w:hAnsi="Arial" w:cs="David"/>
+                <w:rtl/>
+              </w:rPr>
+              <w:t xml:space="preserve">מפה ומסלול</w:t>
+            </w:r>
+          </w:p>
+        </w:tc>
+        <w:tc>
+          <w:tcPr/>
+          <w:p>
+            <w:pPr>
+              <w:bidi/>
+              <w:pStyle w:val="Compact"/>
+            </w:pPr>
+            <w:r>
+              <w:rPr>
+                <w:rFonts w:ascii="Arial" w:hAnsi="Arial" w:cs="David"/>
+                <w:rtl/>
+              </w:rPr>
+              <w:t xml:space="preserve">כפתור</w:t>
+            </w:r>
+            <w:r>
+              <w:rPr>
+                <w:rFonts w:ascii="Arial" w:hAnsi="Arial" w:cs="David"/>
+                <w:rtl/>
+              </w:rPr>
+              <w:t xml:space="preserve"> </w:t>
+            </w:r>
+            <w:r>
+              <w:rPr>
+                <w:rFonts w:ascii="Arial" w:hAnsi="Arial" w:cs="David"/>
+                <w:rtl/>
+              </w:rPr>
+              <w:t xml:space="preserve">“</w:t>
+            </w:r>
+            <w:r>
+              <w:rPr>
+                <w:rFonts w:ascii="Arial" w:hAnsi="Arial" w:cs="David"/>
+                <w:rtl/>
+              </w:rPr>
+              <w:t xml:space="preserve">מיקום שגוי?</w:t>
+            </w:r>
+            <w:r>
+              <w:rPr>
+                <w:rFonts w:ascii="Arial" w:hAnsi="Arial" w:cs="David"/>
+                <w:rtl/>
+              </w:rPr>
+              <w:t xml:space="preserve">”</w:t>
+            </w:r>
+            <w:r>
+              <w:rPr>
+                <w:rFonts w:ascii="Arial" w:hAnsi="Arial" w:cs="David"/>
+                <w:rtl/>
+              </w:rPr>
+              <w:t xml:space="preserve"> </w:t>
+            </w:r>
+            <w:r>
+              <w:rPr>
+                <w:rFonts w:ascii="Arial" w:hAnsi="Arial" w:cs="David"/>
+                <w:rtl/>
+              </w:rPr>
+              <w:t xml:space="preserve">פותח את הכיול, במקום נגיעה ארוכה במפה</w:t>
+            </w:r>
+          </w:p>
+        </w:tc>
+        <w:tc>
+          <w:tcPr/>
+          <w:p>
+            <w:pPr>
+              <w:bidi/>
+              <w:pStyle w:val="Compact"/>
+            </w:pPr>
+            <w:r>
+              <w:rPr>
+                <w:rFonts w:ascii="Arial" w:hAnsi="Arial" w:cs="David"/>
+                <w:bCs/>
+                <w:b/>
+                <w:rtl/>
+              </w:rPr>
+              <w:t xml:space="preserve">מאמצים.</w:t>
+            </w:r>
+            <w:r>
+              <w:rPr>
+                <w:rFonts w:ascii="Arial" w:hAnsi="Arial" w:cs="David"/>
+                <w:rtl/>
+              </w:rPr>
+              <w:t xml:space="preserve"> </w:t>
+            </w:r>
+            <w:r>
+              <w:rPr>
+                <w:rFonts w:ascii="Arial" w:hAnsi="Arial" w:cs="David"/>
+                <w:rtl/>
+              </w:rPr>
+              <w:t xml:space="preserve">כפתור גלוי עדיף על מחווה שאף אחד לא יגלה</w:t>
+            </w:r>
+          </w:p>
+        </w:tc>
+      </w:tr>
+      <w:tr>
+        <w:tc>
+          <w:tcPr/>
+          <w:p>
+            <w:pPr>
+              <w:bidi/>
+              <w:pStyle w:val="Compact"/>
+            </w:pPr>
+            <w:r>
+              <w:rPr>
+                <w:rFonts w:ascii="Arial" w:hAnsi="Arial" w:cs="David"/>
+              </w:rPr>
+              <w:t xml:space="preserve">4</w:t>
+            </w:r>
+          </w:p>
+        </w:tc>
+        <w:tc>
+          <w:tcPr/>
+          <w:p>
+            <w:pPr>
+              <w:bidi/>
+              <w:pStyle w:val="Compact"/>
+            </w:pPr>
+            <w:r>
+              <w:rPr>
+                <w:rFonts w:ascii="Arial" w:hAnsi="Arial" w:cs="David"/>
+                <w:rtl/>
+              </w:rPr>
+              <w:t xml:space="preserve">בקשת הרשאות</w:t>
+            </w:r>
+          </w:p>
+        </w:tc>
+        <w:tc>
+          <w:tcPr/>
+          <w:p>
+            <w:pPr>
+              <w:bidi/>
+              <w:pStyle w:val="Compact"/>
+            </w:pPr>
+            <w:r>
+              <w:rPr>
+                <w:rFonts w:ascii="Arial" w:hAnsi="Arial" w:cs="David"/>
+                <w:rtl/>
+              </w:rPr>
+              <w:t xml:space="preserve">עוצב כמסך נפרד</w:t>
+            </w:r>
+          </w:p>
+        </w:tc>
+        <w:tc>
+          <w:tcPr/>
+          <w:p>
+            <w:pPr>
+              <w:bidi/>
+              <w:pStyle w:val="Compact"/>
+            </w:pPr>
+            <w:r>
+              <w:rPr>
+                <w:rFonts w:ascii="Arial" w:hAnsi="Arial" w:cs="David"/>
+                <w:rtl/>
+              </w:rPr>
+              <w:t xml:space="preserve">מצב שני של SplashActivity, בלי מחלקה חדשה</w:t>
+            </w:r>
+          </w:p>
+        </w:tc>
+      </w:tr>
+      <w:tr>
+        <w:tc>
+          <w:tcPr/>
+          <w:p>
+            <w:pPr>
+              <w:bidi/>
+              <w:pStyle w:val="Compact"/>
+            </w:pPr>
+            <w:r>
+              <w:rPr>
+                <w:rFonts w:ascii="Arial" w:hAnsi="Arial" w:cs="David"/>
+              </w:rPr>
+              <w:t xml:space="preserve">5</w:t>
+            </w:r>
+          </w:p>
+        </w:tc>
+        <w:tc>
+          <w:tcPr/>
+          <w:p>
+            <w:pPr>
+              <w:bidi/>
+              <w:pStyle w:val="Compact"/>
+            </w:pPr>
+            <w:r>
+              <w:rPr>
+                <w:rFonts w:ascii="Arial" w:hAnsi="Arial" w:cs="David"/>
+                <w:rtl/>
+              </w:rPr>
+              <w:t xml:space="preserve">כמה מסכים</w:t>
+            </w:r>
+          </w:p>
+        </w:tc>
+        <w:tc>
+          <w:tcPr/>
+          <w:p>
+            <w:pPr>
+              <w:bidi/>
+              <w:pStyle w:val="Compact"/>
+            </w:pPr>
+            <w:r>
+              <w:rPr>
+                <w:rFonts w:ascii="Arial" w:hAnsi="Arial" w:cs="David"/>
+                <w:rtl/>
+              </w:rPr>
+              <w:t xml:space="preserve">כותרות באנגלית שנשארו מ-Figma: Destination Details, Arrival Dialog, Location Calibration, Staff Login, Campus Search, Campus Map</w:t>
+            </w:r>
+          </w:p>
+        </w:tc>
+        <w:tc>
+          <w:tcPr/>
+          <w:p>
+            <w:pPr>
+              <w:bidi/>
+              <w:pStyle w:val="Compact"/>
+            </w:pPr>
+            <w:r>
+              <w:rPr>
+                <w:rFonts w:ascii="Arial" w:hAnsi="Arial" w:cs="David"/>
+                <w:rtl/>
+              </w:rPr>
+              <w:t xml:space="preserve">ב-XML כל הכותרות בעברית, מתוך</w:t>
+            </w:r>
+            <w:r>
+              <w:rPr>
+                <w:rFonts w:ascii="Arial" w:hAnsi="Arial" w:cs="David"/>
+                <w:rtl/>
+              </w:rPr>
+              <w:t xml:space="preserve"> </w:t>
+            </w:r>
+            <w:r>
+              <w:rPr>
+                <w:rFonts w:ascii="Arial" w:hAnsi="Arial" w:cs="David"/>
+                <w:rStyle w:val="VerbatimChar"/>
+              </w:rPr>
+              <w:t xml:space="preserve">strings.xml</w:t>
+            </w:r>
+          </w:p>
+        </w:tc>
+      </w:tr>
+      <w:tr>
+        <w:tc>
+          <w:tcPr/>
+          <w:p>
+            <w:pPr>
+              <w:bidi/>
+              <w:pStyle w:val="Compact"/>
+            </w:pPr>
+            <w:r>
+              <w:rPr>
+                <w:rFonts w:ascii="Arial" w:hAnsi="Arial" w:cs="David"/>
+              </w:rPr>
+              <w:t xml:space="preserve">6</w:t>
+            </w:r>
+          </w:p>
+        </w:tc>
+        <w:tc>
+          <w:tcPr/>
+          <w:p>
+            <w:pPr>
+              <w:bidi/>
+              <w:pStyle w:val="Compact"/>
+            </w:pPr>
+            <w:r>
+              <w:rPr>
+                <w:rFonts w:ascii="Arial" w:hAnsi="Arial" w:cs="David"/>
+                <w:rtl/>
+              </w:rPr>
+              <w:t xml:space="preserve">מצלמה AR</w:t>
+            </w:r>
+          </w:p>
+        </w:tc>
+        <w:tc>
+          <w:tcPr/>
+          <w:p>
+            <w:pPr>
+              <w:bidi/>
+              <w:pStyle w:val="Compact"/>
+            </w:pPr>
+            <w:r>
+              <w:rPr>
+                <w:rFonts w:ascii="Arial" w:hAnsi="Arial" w:cs="David"/>
+                <w:rtl/>
+              </w:rPr>
+              <w:t xml:space="preserve">המסך מצויר כטלפון בתוך טלפון, עם כפתור צילום ומצבי PHOTO/VIDEO של אפליקציית מצלמה</w:t>
+            </w:r>
+          </w:p>
+        </w:tc>
+        <w:tc>
+          <w:tcPr/>
+          <w:p>
+            <w:pPr>
+              <w:bidi/>
+              <w:pStyle w:val="Compact"/>
+            </w:pPr>
+            <w:r>
+              <w:rPr>
+                <w:rFonts w:ascii="Arial" w:hAnsi="Arial" w:cs="David"/>
+                <w:rtl/>
+              </w:rPr>
+              <w:t xml:space="preserve">ב-XML תצוגת המצלמה ממלאת את המסך, בלי כפתור צילום</w:t>
+            </w:r>
+          </w:p>
+        </w:tc>
+      </w:tr>
+      <w:tr>
+        <w:tc>
+          <w:tcPr/>
+          <w:p>
+            <w:pPr>
+              <w:bidi/>
+              <w:pStyle w:val="Compact"/>
+            </w:pPr>
+            <w:r>
+              <w:rPr>
+                <w:rFonts w:ascii="Arial" w:hAnsi="Arial" w:cs="David"/>
+              </w:rPr>
+              <w:t xml:space="preserve">7</w:t>
+            </w:r>
+          </w:p>
+        </w:tc>
+        <w:tc>
+          <w:tcPr/>
+          <w:p>
+            <w:pPr>
+              <w:bidi/>
+              <w:pStyle w:val="Compact"/>
+            </w:pPr>
+            <w:r>
+              <w:rPr>
+                <w:rFonts w:ascii="Arial" w:hAnsi="Arial" w:cs="David"/>
+                <w:rtl/>
+              </w:rPr>
+              <w:t xml:space="preserve">מצלמה AR</w:t>
+            </w:r>
+          </w:p>
+        </w:tc>
+        <w:tc>
+          <w:tcPr/>
+          <w:p>
+            <w:pPr>
+              <w:bidi/>
+              <w:pStyle w:val="Compact"/>
+            </w:pPr>
+            <w:r>
+              <w:rPr>
+                <w:rFonts w:ascii="Arial" w:hAnsi="Arial" w:cs="David"/>
+                <w:rtl/>
+              </w:rPr>
+              <w:t xml:space="preserve">פס היעד העליון (</w:t>
+            </w:r>
+            <w:r>
+              <w:rPr>
+                <w:rFonts w:ascii="Arial" w:hAnsi="Arial" w:cs="David"/>
+                <w:rtl/>
+              </w:rPr>
+              <w:t xml:space="preserve">“</w:t>
+            </w:r>
+            <w:r>
+              <w:rPr>
+                <w:rFonts w:ascii="Arial" w:hAnsi="Arial" w:cs="David"/>
+                <w:rtl/>
+              </w:rPr>
+              <w:t xml:space="preserve">ניווט אל: אולם כנסים</w:t>
+            </w:r>
+            <w:r>
+              <w:rPr>
+                <w:rFonts w:ascii="Arial" w:hAnsi="Arial" w:cs="David"/>
+                <w:rtl/>
+              </w:rPr>
+              <w:t xml:space="preserve">”</w:t>
+            </w:r>
+            <w:r>
+              <w:rPr>
+                <w:rFonts w:ascii="Arial" w:hAnsi="Arial" w:cs="David"/>
+                <w:rtl/>
+              </w:rPr>
+              <w:t xml:space="preserve">) הוא חלק מתמונת הרקע, ולא תואם ליעד שבכרטיס (חדר 42)</w:t>
+            </w:r>
+          </w:p>
+        </w:tc>
+        <w:tc>
+          <w:tcPr/>
+          <w:p>
+            <w:pPr>
+              <w:bidi/>
+              <w:pStyle w:val="Compact"/>
+            </w:pPr>
+            <w:r>
+              <w:rPr>
+                <w:rFonts w:ascii="Arial" w:hAnsi="Arial" w:cs="David"/>
+                <w:rtl/>
+              </w:rPr>
+              <w:t xml:space="preserve">ב-XML פס יעד אמיתי ב-TextView, עם שם היעד שנבחר</w:t>
+            </w:r>
+          </w:p>
+        </w:tc>
+      </w:tr>
+      <w:tr>
+        <w:tc>
+          <w:tcPr/>
+          <w:p>
+            <w:pPr>
+              <w:bidi/>
+              <w:pStyle w:val="Compact"/>
+            </w:pPr>
+            <w:r>
+              <w:rPr>
+                <w:rFonts w:ascii="Arial" w:hAnsi="Arial" w:cs="David"/>
+              </w:rPr>
+              <w:t xml:space="preserve">8</w:t>
+            </w:r>
+          </w:p>
+        </w:tc>
+        <w:tc>
+          <w:tcPr/>
+          <w:p>
+            <w:pPr>
+              <w:bidi/>
+              <w:pStyle w:val="Compact"/>
+            </w:pPr>
+            <w:r>
+              <w:rPr>
+                <w:rFonts w:ascii="Arial" w:hAnsi="Arial" w:cs="David"/>
+                <w:rtl/>
+              </w:rPr>
+              <w:t xml:space="preserve">כל הלשוניות</w:t>
+            </w:r>
+          </w:p>
+        </w:tc>
+        <w:tc>
+          <w:tcPr/>
+          <w:p>
+            <w:pPr>
+              <w:bidi/>
+              <w:pStyle w:val="Compact"/>
+            </w:pPr>
+            <w:r>
+              <w:rPr>
+                <w:rFonts w:ascii="Arial" w:hAnsi="Arial" w:cs="David"/>
+                <w:rtl/>
+              </w:rPr>
+              <w:t xml:space="preserve">לשונית המצלמה צבועה כתום גם כשהיא לא נבחרה</w:t>
+            </w:r>
+          </w:p>
+        </w:tc>
+        <w:tc>
+          <w:tcPr/>
+          <w:p>
+            <w:pPr>
+              <w:bidi/>
+              <w:pStyle w:val="Compact"/>
+            </w:pPr>
+            <w:r>
+              <w:rPr>
+                <w:rFonts w:ascii="Arial" w:hAnsi="Arial" w:cs="David"/>
+                <w:rtl/>
+              </w:rPr>
+              <w:t xml:space="preserve">צבע לפי מצב: ירוק לנבחרת, אפור לשאר. הכתום שמור למסלול, לחץ וליעד</w:t>
+            </w:r>
+          </w:p>
+        </w:tc>
+      </w:tr>
+      <w:tr>
+        <w:tc>
+          <w:tcPr/>
+          <w:p>
+            <w:pPr>
+              <w:bidi/>
+              <w:pStyle w:val="Compact"/>
+            </w:pPr>
+            <w:r>
+              <w:rPr>
+                <w:rFonts w:ascii="Arial" w:hAnsi="Arial" w:cs="David"/>
+              </w:rPr>
+              <w:t xml:space="preserve">9</w:t>
+            </w:r>
+          </w:p>
+        </w:tc>
+        <w:tc>
+          <w:tcPr/>
+          <w:p>
+            <w:pPr>
+              <w:bidi/>
+              <w:pStyle w:val="Compact"/>
+            </w:pPr>
+            <w:r>
+              <w:rPr>
+                <w:rFonts w:ascii="Arial" w:hAnsi="Arial" w:cs="David"/>
+                <w:rtl/>
+              </w:rPr>
+              <w:t xml:space="preserve">כניסת צוות</w:t>
+            </w:r>
+          </w:p>
+        </w:tc>
+        <w:tc>
+          <w:tcPr/>
+          <w:p>
+            <w:pPr>
+              <w:bidi/>
+              <w:pStyle w:val="Compact"/>
+            </w:pPr>
+            <w:r>
+              <w:rPr>
+                <w:rFonts w:ascii="Arial" w:hAnsi="Arial" w:cs="David"/>
+                <w:rtl/>
+              </w:rPr>
+              <w:t xml:space="preserve">“</w:t>
+            </w:r>
+            <w:r>
+              <w:rPr>
+                <w:rFonts w:ascii="Arial" w:hAnsi="Arial" w:cs="David"/>
+                <w:rtl/>
+              </w:rPr>
+              <w:t xml:space="preserve">זכור אותי</w:t>
+            </w:r>
+            <w:r>
+              <w:rPr>
+                <w:rFonts w:ascii="Arial" w:hAnsi="Arial" w:cs="David"/>
+                <w:rtl/>
+              </w:rPr>
+              <w:t xml:space="preserve">”</w:t>
+            </w:r>
+            <w:r>
+              <w:rPr>
+                <w:rFonts w:ascii="Arial" w:hAnsi="Arial" w:cs="David"/>
+                <w:rtl/>
+              </w:rPr>
+              <w:t xml:space="preserve"> </w:t>
+            </w:r>
+            <w:r>
+              <w:rPr>
+                <w:rFonts w:ascii="Arial" w:hAnsi="Arial" w:cs="David"/>
+                <w:rtl/>
+              </w:rPr>
+              <w:t xml:space="preserve">ו”שכחת סיסמה?” לא מופיעים בדרישות</w:t>
+            </w:r>
+          </w:p>
+        </w:tc>
+        <w:tc>
+          <w:tcPr/>
+          <w:p>
+            <w:pPr>
+              <w:bidi/>
+              <w:pStyle w:val="Compact"/>
+            </w:pPr>
+            <w:r>
+              <w:rPr>
+                <w:rFonts w:ascii="Arial" w:hAnsi="Arial" w:cs="David"/>
+                <w:rtl/>
+              </w:rPr>
+              <w:t xml:space="preserve">יורדים. Firebase שומר את ההתחברות ממילא</w:t>
+            </w:r>
+          </w:p>
+        </w:tc>
+      </w:tr>
+      <w:tr>
+        <w:tc>
+          <w:tcPr/>
+          <w:p>
+            <w:pPr>
+              <w:bidi/>
+              <w:pStyle w:val="Compact"/>
+            </w:pPr>
+            <w:r>
+              <w:rPr>
+                <w:rFonts w:ascii="Arial" w:hAnsi="Arial" w:cs="David"/>
+              </w:rPr>
+              <w:t xml:space="preserve">10</w:t>
+            </w:r>
+          </w:p>
+        </w:tc>
+        <w:tc>
+          <w:tcPr/>
+          <w:p>
+            <w:pPr>
+              <w:bidi/>
+              <w:pStyle w:val="Compact"/>
+            </w:pPr>
+            <w:r>
+              <w:rPr>
+                <w:rFonts w:ascii="Arial" w:hAnsi="Arial" w:cs="David"/>
+                <w:rtl/>
+              </w:rPr>
+              <w:t xml:space="preserve">הגעת ליעד</w:t>
+            </w:r>
+          </w:p>
+        </w:tc>
+        <w:tc>
+          <w:tcPr/>
+          <w:p>
+            <w:pPr>
+              <w:bidi/>
+              <w:pStyle w:val="Compact"/>
+            </w:pPr>
+            <w:r>
+              <w:rPr>
+                <w:rFonts w:ascii="Arial" w:hAnsi="Arial" w:cs="David"/>
+                <w:rtl/>
+              </w:rPr>
+              <w:t xml:space="preserve">תמונת שלט הדלת לאימות לא מופיעה בדרישות</w:t>
+            </w:r>
+          </w:p>
+        </w:tc>
+        <w:tc>
+          <w:tcPr/>
+          <w:p>
+            <w:pPr>
+              <w:bidi/>
+              <w:pStyle w:val="Compact"/>
+            </w:pPr>
+            <w:r>
+              <w:rPr>
+                <w:rFonts w:ascii="Arial" w:hAnsi="Arial" w:cs="David"/>
+                <w:rtl/>
+              </w:rPr>
+              <w:t xml:space="preserve">יורדת בשלב זה, ונרשמת כרעיון לשיפור</w:t>
+            </w:r>
+          </w:p>
+        </w:tc>
+      </w:tr>
+      <w:tr>
+        <w:tc>
+          <w:tcPr/>
+          <w:p>
+            <w:pPr>
+              <w:bidi/>
+              <w:pStyle w:val="Compact"/>
+            </w:pPr>
+            <w:r>
+              <w:rPr>
+                <w:rFonts w:ascii="Arial" w:hAnsi="Arial" w:cs="David"/>
+              </w:rPr>
+              <w:t xml:space="preserve">11</w:t>
+            </w:r>
+          </w:p>
+        </w:tc>
+        <w:tc>
+          <w:tcPr/>
+          <w:p>
+            <w:pPr>
+              <w:bidi/>
+              <w:pStyle w:val="Compact"/>
+            </w:pPr>
+            <w:r>
+              <w:rPr>
+                <w:rFonts w:ascii="Arial" w:hAnsi="Arial" w:cs="David"/>
+                <w:rtl/>
+              </w:rPr>
+              <w:t xml:space="preserve">כמה מסכים</w:t>
+            </w:r>
+          </w:p>
+        </w:tc>
+        <w:tc>
+          <w:tcPr/>
+          <w:p>
+            <w:pPr>
+              <w:bidi/>
+              <w:pStyle w:val="Compact"/>
+            </w:pPr>
+            <w:r>
+              <w:rPr>
+                <w:rFonts w:ascii="Arial" w:hAnsi="Arial" w:cs="David"/>
+                <w:rtl/>
+              </w:rPr>
+              <w:t xml:space="preserve">טקסט משני אפור בהיר וקטן (מספר גרסה, הסברים) קשה לקריאה בשמש</w:t>
+            </w:r>
+          </w:p>
+        </w:tc>
+        <w:tc>
+          <w:tcPr/>
+          <w:p>
+            <w:pPr>
+              <w:bidi/>
+              <w:pStyle w:val="Compact"/>
+            </w:pPr>
+            <w:r>
+              <w:rPr>
+                <w:rFonts w:ascii="Arial" w:hAnsi="Arial" w:cs="David"/>
+                <w:rtl/>
+              </w:rPr>
+              <w:t xml:space="preserve">ב-XML לפחות 14sp ובצבע #5F6368</w:t>
+            </w:r>
+          </w:p>
+        </w:tc>
+      </w:tr>
+    </w:tbl>
+    <w:p>
+      <w:pPr>
+        <w:bidi/>
+        <w:pStyle w:val="BlockText"/>
+      </w:pPr>
+      <w:r>
+        <w:rPr>
+          <w:rFonts w:ascii="Arial" w:hAnsi="Arial" w:cs="David"/>
+          <w:bCs/>
+          <w:b/>
+          <w:rtl/>
+        </w:rPr>
+        <w:t xml:space="preserve">הערה לתלמידים:</w:t>
+      </w:r>
+      <w:r>
+        <w:rPr>
+          <w:rFonts w:ascii="Arial" w:hAnsi="Arial" w:cs="David"/>
+          <w:rtl/>
+        </w:rPr>
+        <w:t xml:space="preserve"> </w:t>
+      </w:r>
+      <w:r>
+        <w:rPr>
+          <w:rFonts w:ascii="Arial" w:hAnsi="Arial" w:cs="David"/>
+          <w:rtl/>
+        </w:rPr>
+        <w:t xml:space="preserve">סקירת עיצוב היא חלק רגיל מהעבודה. כל ממצא מקבל החלטה, ומה שהשתנה מתעדכן במסמכים: כאן ממצאים 1–3 שינו את טבלת המסכים בתיק ואת תרשים המסכים. בפרק הרפלקציה בתיק כדאי לכתוב מה השתנה בין העיצוב לאפליקציה, ולמה.</w:t>
+      </w:r>
+    </w:p>
+    <w:bookmarkEnd w:id="49"/>
+    <w:bookmarkEnd w:id="50"/>
     <w:sectPr>
       <w:headerReference w:type="default" r:id="rId9"/>
       <w:footerReference w:type="default" r:id="rId10"/>

</xml_diff>

<commit_message>
M3: close the skeleton and search stage
- Project plan (wiki and Claude Docs): M3 done on 24.10.2026, status table, a note
  for students on why the next deadlines are not moved earlier
- Working in GitHub: M3 done; automated checks are a step of every task
- Design guide: finding 12 (no navigation-notes field)
- tasks.py: T08, T09, T10, T30 closed
- Word files rebuilt; build_word.py drops the GitHub "[!NOTE]" marker,
  which pandoc printed as text in every student note

Co-Authored-By: Claude Opus 5.5 <noreply@anthropic.com>
Claude-Session: https://claude.ai/code/session_01DwjjT9GqatJDYv6YmdaLvY
</commit_message>
<xml_diff>
--- a/docs/word/מדריך עיצוב מסכים - ניווט אלוני יצחק.docx
+++ b/docs/word/מדריך עיצוב מסכים - ניווט אלוני יצחק.docx
@@ -4769,24 +4769,144 @@
           </w:p>
         </w:tc>
       </w:tr>
+      <w:tr>
+        <w:tc>
+          <w:tcPr/>
+          <w:p>
+            <w:pPr>
+              <w:pStyle w:val="Compact"/>
+              <w:bidi/>
+              <w:jc w:val="left"/>
+            </w:pPr>
+            <w:r>
+              <w:rPr>
+                <w:rtl/>
+              </w:rPr>
+              <w:t xml:space="preserve">12</w:t>
+            </w:r>
+          </w:p>
+        </w:tc>
+        <w:tc>
+          <w:tcPr/>
+          <w:p>
+            <w:pPr>
+              <w:pStyle w:val="Compact"/>
+              <w:bidi/>
+              <w:jc w:val="left"/>
+            </w:pPr>
+            <w:r>
+              <w:rPr>
+                <w:rtl/>
+              </w:rPr>
+              <w:t xml:space="preserve">ניהול חדרים</w:t>
+            </w:r>
+          </w:p>
+        </w:tc>
+        <w:tc>
+          <w:tcPr/>
+          <w:p>
+            <w:pPr>
+              <w:pStyle w:val="Compact"/>
+              <w:bidi/>
+              <w:jc w:val="left"/>
+            </w:pPr>
+            <w:r>
+              <w:rPr>
+                <w:rtl/>
+              </w:rPr>
+              <w:t xml:space="preserve">שדה</w:t>
+            </w:r>
+            <w:r>
+              <w:rPr>
+                <w:rtl/>
+              </w:rPr>
+              <w:t xml:space="preserve"> </w:t>
+            </w:r>
+            <w:r>
+              <w:rPr>
+                <w:rtl/>
+              </w:rPr>
+              <w:t xml:space="preserve">“</w:t>
+            </w:r>
+            <w:r>
+              <w:rPr>
+                <w:rtl/>
+              </w:rPr>
+              <w:t xml:space="preserve">הערות ניווט וציון דרך AR</w:t>
+            </w:r>
+            <w:r>
+              <w:rPr>
+                <w:rtl/>
+              </w:rPr>
+              <w:t xml:space="preserve">”</w:t>
+            </w:r>
+            <w:r>
+              <w:rPr>
+                <w:rtl/>
+              </w:rPr>
+              <w:t xml:space="preserve"> </w:t>
+            </w:r>
+            <w:r>
+              <w:rPr>
+                <w:rtl/>
+              </w:rPr>
+              <w:t xml:space="preserve">לא קיים במודל הנתונים (לחדר יש מספר, שם, אחראי וכניסה). נמצא בזמן בניית ה-XML (T30)</w:t>
+            </w:r>
+          </w:p>
+        </w:tc>
+        <w:tc>
+          <w:tcPr/>
+          <w:p>
+            <w:pPr>
+              <w:pStyle w:val="Compact"/>
+              <w:bidi/>
+              <w:jc w:val="left"/>
+            </w:pPr>
+            <w:r>
+              <w:rPr>
+                <w:rtl/>
+              </w:rPr>
+              <w:t xml:space="preserve">יורד בשלב זה, ונרשם כרעיון לשיפור</w:t>
+            </w:r>
+          </w:p>
+        </w:tc>
+      </w:tr>
     </w:tbl>
     <w:p>
       <w:pPr>
+        <w:bidi/>
+      </w:pPr>
+      <w:r>
+        <w:rPr>
+          <w:rtl/>
+        </w:rPr>
+        <w:t xml:space="preserve">ממצאים 5–12 תוקנו בקובצי ה-XML במטלה T30. איך העיצוב הפך ל-XML, ואיך כל מסך נבדק מול העיצוב שלו בתמונת snapshot, מתואר ב-</w:t>
+      </w:r>
+      <w:r>
+        <w:rPr>
+          <w:rStyle w:val="VerbatimChar"/>
+          <w:rtl/>
+        </w:rPr>
+        <w:t xml:space="preserve">docs/design/README.md</w:t>
+      </w:r>
+      <w:r>
+        <w:rPr>
+          <w:rtl/>
+        </w:rPr>
+        <w:t xml:space="preserve"> </w:t>
+      </w:r>
+      <w:r>
+        <w:rPr>
+          <w:rtl/>
+        </w:rPr>
+        <w:t xml:space="preserve">במאגר.</w:t>
+      </w:r>
+    </w:p>
+    <w:p>
+      <w:pPr>
         <w:pStyle w:val="BlockText"/>
         <w:bidi/>
       </w:pPr>
-      <w:r>
-        <w:rPr>
-          <w:rtl/>
-        </w:rPr>
-        <w:t xml:space="preserve">[!NOTE]</w:t>
-      </w:r>
-      <w:r>
-        <w:rPr>
-          <w:rtl/>
-        </w:rPr>
-        <w:t xml:space="preserve"> </w:t>
-      </w:r>
       <w:r>
         <w:rPr>
           <w:rtl/>

</xml_diff>

<commit_message>
M3: close the skeleton and search stage (#43)
- Project plan (wiki and Claude Docs): M3 done on 24.10.2026, status table, a note
  for students on why the next deadlines are not moved earlier
- Working in GitHub: M3 done; automated checks are a step of every task
- Design guide: finding 12 (no navigation-notes field)
- tasks.py: T08, T09, T10, T30 closed
- Word files rebuilt; build_word.py drops the GitHub "[!NOTE]" marker,
  which pandoc printed as text in every student note


Claude-Session: https://claude.ai/code/session_01DwjjT9GqatJDYv6YmdaLvY

Co-authored-by: Claude <noreply@anthropic.com>
</commit_message>
<xml_diff>
--- a/docs/word/מדריך עיצוב מסכים - ניווט אלוני יצחק.docx
+++ b/docs/word/מדריך עיצוב מסכים - ניווט אלוני יצחק.docx
@@ -4769,24 +4769,144 @@
           </w:p>
         </w:tc>
       </w:tr>
+      <w:tr>
+        <w:tc>
+          <w:tcPr/>
+          <w:p>
+            <w:pPr>
+              <w:pStyle w:val="Compact"/>
+              <w:bidi/>
+              <w:jc w:val="left"/>
+            </w:pPr>
+            <w:r>
+              <w:rPr>
+                <w:rtl/>
+              </w:rPr>
+              <w:t xml:space="preserve">12</w:t>
+            </w:r>
+          </w:p>
+        </w:tc>
+        <w:tc>
+          <w:tcPr/>
+          <w:p>
+            <w:pPr>
+              <w:pStyle w:val="Compact"/>
+              <w:bidi/>
+              <w:jc w:val="left"/>
+            </w:pPr>
+            <w:r>
+              <w:rPr>
+                <w:rtl/>
+              </w:rPr>
+              <w:t xml:space="preserve">ניהול חדרים</w:t>
+            </w:r>
+          </w:p>
+        </w:tc>
+        <w:tc>
+          <w:tcPr/>
+          <w:p>
+            <w:pPr>
+              <w:pStyle w:val="Compact"/>
+              <w:bidi/>
+              <w:jc w:val="left"/>
+            </w:pPr>
+            <w:r>
+              <w:rPr>
+                <w:rtl/>
+              </w:rPr>
+              <w:t xml:space="preserve">שדה</w:t>
+            </w:r>
+            <w:r>
+              <w:rPr>
+                <w:rtl/>
+              </w:rPr>
+              <w:t xml:space="preserve"> </w:t>
+            </w:r>
+            <w:r>
+              <w:rPr>
+                <w:rtl/>
+              </w:rPr>
+              <w:t xml:space="preserve">“</w:t>
+            </w:r>
+            <w:r>
+              <w:rPr>
+                <w:rtl/>
+              </w:rPr>
+              <w:t xml:space="preserve">הערות ניווט וציון דרך AR</w:t>
+            </w:r>
+            <w:r>
+              <w:rPr>
+                <w:rtl/>
+              </w:rPr>
+              <w:t xml:space="preserve">”</w:t>
+            </w:r>
+            <w:r>
+              <w:rPr>
+                <w:rtl/>
+              </w:rPr>
+              <w:t xml:space="preserve"> </w:t>
+            </w:r>
+            <w:r>
+              <w:rPr>
+                <w:rtl/>
+              </w:rPr>
+              <w:t xml:space="preserve">לא קיים במודל הנתונים (לחדר יש מספר, שם, אחראי וכניסה). נמצא בזמן בניית ה-XML (T30)</w:t>
+            </w:r>
+          </w:p>
+        </w:tc>
+        <w:tc>
+          <w:tcPr/>
+          <w:p>
+            <w:pPr>
+              <w:pStyle w:val="Compact"/>
+              <w:bidi/>
+              <w:jc w:val="left"/>
+            </w:pPr>
+            <w:r>
+              <w:rPr>
+                <w:rtl/>
+              </w:rPr>
+              <w:t xml:space="preserve">יורד בשלב זה, ונרשם כרעיון לשיפור</w:t>
+            </w:r>
+          </w:p>
+        </w:tc>
+      </w:tr>
     </w:tbl>
     <w:p>
       <w:pPr>
+        <w:bidi/>
+      </w:pPr>
+      <w:r>
+        <w:rPr>
+          <w:rtl/>
+        </w:rPr>
+        <w:t xml:space="preserve">ממצאים 5–12 תוקנו בקובצי ה-XML במטלה T30. איך העיצוב הפך ל-XML, ואיך כל מסך נבדק מול העיצוב שלו בתמונת snapshot, מתואר ב-</w:t>
+      </w:r>
+      <w:r>
+        <w:rPr>
+          <w:rStyle w:val="VerbatimChar"/>
+          <w:rtl/>
+        </w:rPr>
+        <w:t xml:space="preserve">docs/design/README.md</w:t>
+      </w:r>
+      <w:r>
+        <w:rPr>
+          <w:rtl/>
+        </w:rPr>
+        <w:t xml:space="preserve"> </w:t>
+      </w:r>
+      <w:r>
+        <w:rPr>
+          <w:rtl/>
+        </w:rPr>
+        <w:t xml:space="preserve">במאגר.</w:t>
+      </w:r>
+    </w:p>
+    <w:p>
+      <w:pPr>
         <w:pStyle w:val="BlockText"/>
         <w:bidi/>
       </w:pPr>
-      <w:r>
-        <w:rPr>
-          <w:rtl/>
-        </w:rPr>
-        <w:t xml:space="preserve">[!NOTE]</w:t>
-      </w:r>
-      <w:r>
-        <w:rPr>
-          <w:rtl/>
-        </w:rPr>
-        <w:t xml:space="preserve"> </w:t>
-      </w:r>
       <w:r>
         <w:rPr>
           <w:rtl/>

</xml_diff>